<commit_message>
feat: complete Docker Compose microservice orchestration & dual-track deployment baseline
</commit_message>
<xml_diff>
--- a/docs/03-report/实训文档/23030301曹磊-1/1-第2周报.docx
+++ b/docs/03-report/实训文档/23030301曹磊-1/1-第2周报.docx
@@ -1,6 +1,6 @@
 
 <file path=word/document.xml><?xml version="1.0" encoding="utf-8"?>
-<w:document xmlns:a="http://schemas.openxmlformats.org/drawingml/2006/main" xmlns:pic="http://schemas.openxmlformats.org/drawingml/2006/picture" xmlns:a14="http://schemas.microsoft.com/office/drawing/2010/main" xmlns:wpc="http://schemas.microsoft.com/office/word/2010/wordprocessingCanvas" xmlns:cx="http://schemas.microsoft.com/office/drawing/2014/chartex" xmlns:cx1="http://schemas.microsoft.com/office/drawing/2015/9/8/chartex" xmlns:cx2="http://schemas.microsoft.com/office/drawing/2015/10/21/chartex" xmlns:cx3="http://schemas.microsoft.com/office/drawing/2016/5/9/chartex" xmlns:cx4="http://schemas.microsoft.com/office/drawing/2016/5/10/chartex" xmlns:cx5="http://schemas.microsoft.com/office/drawing/2016/5/11/chartex" xmlns:cx6="http://schemas.microsoft.com/office/drawing/2016/5/12/chartex" xmlns:cx7="http://schemas.microsoft.com/office/drawing/2016/5/13/chartex" xmlns:cx8="http://schemas.microsoft.com/office/drawing/2016/5/14/chartex" xmlns:mc="http://schemas.openxmlformats.org/markup-compatibility/2006" xmlns:aink="http://schemas.microsoft.com/office/drawing/2016/ink" xmlns:am3d="http://schemas.microsoft.com/office/drawing/2017/model3d" xmlns:o="urn:schemas-microsoft-com:office:office" xmlns:oel="http://schemas.microsoft.com/office/2019/extlst" xmlns:r="http://schemas.openxmlformats.org/officeDocument/2006/relationships" xmlns:m="http://schemas.openxmlformats.org/officeDocument/2006/math" xmlns:v="urn:schemas-microsoft-com:vml" xmlns:wp14="http://schemas.microsoft.com/office/word/2010/wordprocessingDrawing" xmlns:wp="http://schemas.openxmlformats.org/drawingml/2006/wordprocessingDrawing" xmlns:w10="urn:schemas-microsoft-com:office:word" xmlns:w="http://schemas.openxmlformats.org/wordprocessingml/2006/main" xmlns:w14="http://schemas.microsoft.com/office/word/2010/wordml" xmlns:w15="http://schemas.microsoft.com/office/word/2012/wordml" xmlns:w16cex="http://schemas.microsoft.com/office/word/2018/wordml/cex" xmlns:w16cid="http://schemas.microsoft.com/office/word/2016/wordml/cid" xmlns:w16="http://schemas.microsoft.com/office/word/2018/wordml" xmlns:w16du="http://schemas.microsoft.com/office/word/2023/wordml/word16du" xmlns:w16sdtdh="http://schemas.microsoft.com/office/word/2020/wordml/sdtdatahash" xmlns:w16sdtfl="http://schemas.microsoft.com/office/word/2024/wordml/sdtformatlock" xmlns:w16se="http://schemas.microsoft.com/office/word/2015/wordml/symex" xmlns:wpg="http://schemas.microsoft.com/office/word/2010/wordprocessingGroup" xmlns:wpi="http://schemas.microsoft.com/office/word/2010/wordprocessingInk" xmlns:wne="http://schemas.microsoft.com/office/word/2006/wordml" xmlns:wps="http://schemas.microsoft.com/office/word/2010/wordprocessingShape" mc:Ignorable="w14 w15 w16se w16cid w16 w16cex w16sdtdh w16sdtfl w16du wp14">
+<w:document xmlns:wpc="http://schemas.microsoft.com/office/word/2010/wordprocessingCanvas" xmlns:cx="http://schemas.microsoft.com/office/drawing/2014/chartex" xmlns:cx1="http://schemas.microsoft.com/office/drawing/2015/9/8/chartex" xmlns:cx2="http://schemas.microsoft.com/office/drawing/2015/10/21/chartex" xmlns:cx3="http://schemas.microsoft.com/office/drawing/2016/5/9/chartex" xmlns:cx4="http://schemas.microsoft.com/office/drawing/2016/5/10/chartex" xmlns:cx5="http://schemas.microsoft.com/office/drawing/2016/5/11/chartex" xmlns:cx6="http://schemas.microsoft.com/office/drawing/2016/5/12/chartex" xmlns:cx7="http://schemas.microsoft.com/office/drawing/2016/5/13/chartex" xmlns:cx8="http://schemas.microsoft.com/office/drawing/2016/5/14/chartex" xmlns:mc="http://schemas.openxmlformats.org/markup-compatibility/2006" xmlns:aink="http://schemas.microsoft.com/office/drawing/2016/ink" xmlns:am3d="http://schemas.microsoft.com/office/drawing/2017/model3d" xmlns:o="urn:schemas-microsoft-com:office:office" xmlns:oel="http://schemas.microsoft.com/office/2019/extlst" xmlns:r="http://schemas.openxmlformats.org/officeDocument/2006/relationships" xmlns:m="http://schemas.openxmlformats.org/officeDocument/2006/math" xmlns:v="urn:schemas-microsoft-com:vml" xmlns:wp14="http://schemas.microsoft.com/office/word/2010/wordprocessingDrawing" xmlns:wp="http://schemas.openxmlformats.org/drawingml/2006/wordprocessingDrawing" xmlns:w10="urn:schemas-microsoft-com:office:word" xmlns:w="http://schemas.openxmlformats.org/wordprocessingml/2006/main" xmlns:w14="http://schemas.microsoft.com/office/word/2010/wordml" xmlns:w15="http://schemas.microsoft.com/office/word/2012/wordml" xmlns:w16cex="http://schemas.microsoft.com/office/word/2018/wordml/cex" xmlns:w16cid="http://schemas.microsoft.com/office/word/2016/wordml/cid" xmlns:w16="http://schemas.microsoft.com/office/word/2018/wordml" xmlns:w16du="http://schemas.microsoft.com/office/word/2023/wordml/word16du" xmlns:w16sdtdh="http://schemas.microsoft.com/office/word/2020/wordml/sdtdatahash" xmlns:w16sdtfl="http://schemas.microsoft.com/office/word/2024/wordml/sdtformatlock" xmlns:w16se="http://schemas.microsoft.com/office/word/2015/wordml/symex" xmlns:wpg="http://schemas.microsoft.com/office/word/2010/wordprocessingGroup" xmlns:wpi="http://schemas.microsoft.com/office/word/2010/wordprocessingInk" xmlns:wne="http://schemas.microsoft.com/office/word/2006/wordml" xmlns:wps="http://schemas.microsoft.com/office/word/2010/wordprocessingShape" mc:Ignorable="w14 w15 w16se w16cid w16 w16cex w16sdtdh w16sdtfl w16du wp14">
   <w:body>
     <w:p>
       <w:r>
@@ -9,7 +9,7 @@
           <w:sz w:val="20"/>
         </w:rPr>
         <w:drawing>
-          <wp:anchor distT="0" distB="0" distL="114300" distR="114300" simplePos="0" relativeHeight="251659264" behindDoc="0" locked="0" layoutInCell="1" allowOverlap="1" wp14:editId="55EAABFD" wp14:anchorId="56D8CAD8">
+          <wp:anchor distT="0" distB="0" distL="114300" distR="114300" simplePos="0" relativeHeight="251659264" behindDoc="0" locked="0" layoutInCell="1" allowOverlap="1" wp14:anchorId="56D8CAD8" wp14:editId="55EAABFD">
             <wp:simplePos x="0" y="0"/>
             <wp:positionH relativeFrom="column">
               <wp:posOffset>1257300</wp:posOffset>
@@ -82,7 +82,7 @@
       </w:pPr>
       <w:r>
         <w:rPr>
-          <w:rFonts w:hint="eastAsia" w:ascii="Times" w:hAnsi="Times"/>
+          <w:rFonts w:ascii="Times" w:hAnsi="Times" w:hint="eastAsia"/>
         </w:rPr>
         <w:t>CHANGZHOU   INSTITUTE   OF   TECHNOLOGY</w:t>
       </w:r>
@@ -100,14 +100,14 @@
         <w:pStyle w:val="1"/>
         <w:jc w:val="center"/>
         <w:rPr>
-          <w:rFonts w:ascii="微软雅黑" w:hAnsi="微软雅黑" w:eastAsia="微软雅黑"/>
+          <w:rFonts w:ascii="微软雅黑" w:eastAsia="微软雅黑" w:hAnsi="微软雅黑"/>
           <w:sz w:val="52"/>
           <w:szCs w:val="52"/>
         </w:rPr>
       </w:pPr>
       <w:r>
         <w:rPr>
-          <w:rFonts w:hint="eastAsia" w:ascii="微软雅黑" w:hAnsi="微软雅黑" w:eastAsia="微软雅黑"/>
+          <w:rFonts w:ascii="微软雅黑" w:eastAsia="微软雅黑" w:hAnsi="微软雅黑" w:hint="eastAsia"/>
           <w:sz w:val="52"/>
           <w:szCs w:val="52"/>
         </w:rPr>
@@ -117,7 +117,7 @@
     <w:p>
       <w:pPr>
         <w:spacing w:line="480" w:lineRule="auto"/>
-        <w:ind w:firstLine="1807" w:firstLineChars="600"/>
+        <w:ind w:firstLineChars="600" w:firstLine="1807"/>
         <w:rPr>
           <w:spacing w:val="60"/>
           <w:sz w:val="30"/>
@@ -169,7 +169,7 @@
     <w:p>
       <w:pPr>
         <w:spacing w:line="480" w:lineRule="auto"/>
-        <w:ind w:firstLine="1807" w:firstLineChars="600"/>
+        <w:ind w:firstLineChars="600" w:firstLine="1807"/>
         <w:rPr>
           <w:sz w:val="30"/>
           <w:u w:val="single"/>
@@ -228,7 +228,7 @@
     <w:p>
       <w:pPr>
         <w:spacing w:line="480" w:lineRule="auto"/>
-        <w:ind w:firstLine="1807" w:firstLineChars="600"/>
+        <w:ind w:firstLineChars="600" w:firstLine="1800"/>
         <w:rPr>
           <w:sz w:val="30"/>
           <w:u w:val="single"/>
@@ -236,33 +236,84 @@
       </w:pPr>
       <w:r>
         <w:rPr>
-          <w:rFonts w:hint="eastAsia"/>
-          <w:b/>
-          <w:sz w:val="30"/>
-        </w:rPr>
-        <w:t xml:space="preserve"/>
-      </w:r>
-      <w:r>
-        <w:rPr>
-          <w:rFonts w:ascii="Times New Roman" w:hAnsi="Times New Roman" w:eastAsia="宋体"/>
-          <w:sz w:val="30"/>
-          <w:u w:val="none"/>
-        </w:rPr>
-        <w:t xml:space="preserve">班    级           </w:t>
-      </w:r>
-      <w:r>
-        <w:rPr>
-          <w:rFonts w:ascii="Times New Roman" w:hAnsi="Times New Roman" w:eastAsia="宋体"/>
-          <w:sz w:val="30"/>
-          <w:u w:val="single"/>
-        </w:rPr>
-        <w:t xml:space="preserve">   23软件一   </w:t>
+          <w:sz w:val="30"/>
+        </w:rPr>
+        <w:t>班</w:t>
+      </w:r>
+      <w:r>
+        <w:rPr>
+          <w:sz w:val="30"/>
+        </w:rPr>
+        <w:t xml:space="preserve">    </w:t>
+      </w:r>
+      <w:r>
+        <w:rPr>
+          <w:sz w:val="30"/>
+        </w:rPr>
+        <w:t>级</w:t>
+      </w:r>
+      <w:r>
+        <w:rPr>
+          <w:sz w:val="30"/>
+        </w:rPr>
+        <w:t xml:space="preserve"> </w:t>
+      </w:r>
+      <w:r>
+        <w:rPr>
+          <w:sz w:val="30"/>
+          <w:u w:val="single"/>
+        </w:rPr>
+        <w:t xml:space="preserve"> </w:t>
+      </w:r>
+      <w:r>
+        <w:rPr>
+          <w:rFonts w:hint="eastAsia"/>
+          <w:sz w:val="30"/>
+          <w:u w:val="single"/>
+        </w:rPr>
+        <w:t xml:space="preserve">         </w:t>
+      </w:r>
+      <w:r>
+        <w:rPr>
+          <w:sz w:val="30"/>
+          <w:u w:val="single"/>
+        </w:rPr>
+        <w:t xml:space="preserve"> 23</w:t>
+      </w:r>
+      <w:r>
+        <w:rPr>
+          <w:sz w:val="30"/>
+          <w:u w:val="single"/>
+        </w:rPr>
+        <w:t>软件一</w:t>
+      </w:r>
+      <w:r>
+        <w:rPr>
+          <w:sz w:val="30"/>
+          <w:u w:val="single"/>
+        </w:rPr>
+        <w:t xml:space="preserve"> </w:t>
+      </w:r>
+      <w:r>
+        <w:rPr>
+          <w:rFonts w:hint="eastAsia"/>
+          <w:sz w:val="30"/>
+          <w:u w:val="single"/>
+        </w:rPr>
+        <w:t xml:space="preserve">       </w:t>
+      </w:r>
+      <w:r>
+        <w:rPr>
+          <w:sz w:val="30"/>
+          <w:u w:val="single"/>
+        </w:rPr>
+        <w:t xml:space="preserve">  </w:t>
       </w:r>
     </w:p>
     <w:p>
       <w:pPr>
         <w:spacing w:line="480" w:lineRule="auto"/>
-        <w:ind w:firstLine="1807" w:firstLineChars="600"/>
+        <w:ind w:firstLineChars="600" w:firstLine="1800"/>
         <w:rPr>
           <w:sz w:val="30"/>
           <w:u w:val="single"/>
@@ -270,33 +321,79 @@
       </w:pPr>
       <w:r>
         <w:rPr>
-          <w:rFonts w:hint="eastAsia"/>
-          <w:b/>
-          <w:sz w:val="30"/>
-        </w:rPr>
-        <w:t xml:space="preserve"/>
-      </w:r>
-      <w:r>
-        <w:rPr>
-          <w:rFonts w:ascii="Times New Roman" w:hAnsi="Times New Roman" w:eastAsia="宋体"/>
-          <w:sz w:val="30"/>
-          <w:u w:val="none"/>
-        </w:rPr>
-        <w:t xml:space="preserve">学    号            </w:t>
-      </w:r>
-      <w:r>
-        <w:rPr>
-          <w:rFonts w:ascii="Times New Roman" w:hAnsi="Times New Roman" w:eastAsia="宋体"/>
-          <w:sz w:val="30"/>
-          <w:u w:val="single"/>
-        </w:rPr>
-        <w:t xml:space="preserve">  23030301  </w:t>
+          <w:sz w:val="30"/>
+        </w:rPr>
+        <w:t>学</w:t>
+      </w:r>
+      <w:r>
+        <w:rPr>
+          <w:sz w:val="30"/>
+        </w:rPr>
+        <w:t xml:space="preserve">    </w:t>
+      </w:r>
+      <w:r>
+        <w:rPr>
+          <w:sz w:val="30"/>
+        </w:rPr>
+        <w:t>号</w:t>
+      </w:r>
+      <w:r>
+        <w:rPr>
+          <w:sz w:val="30"/>
+        </w:rPr>
+        <w:t xml:space="preserve"> </w:t>
+      </w:r>
+      <w:r>
+        <w:rPr>
+          <w:rFonts w:hint="eastAsia"/>
+          <w:sz w:val="30"/>
+          <w:u w:val="single"/>
+        </w:rPr>
+        <w:t xml:space="preserve"> </w:t>
+      </w:r>
+      <w:r>
+        <w:rPr>
+          <w:rFonts w:hint="eastAsia"/>
+          <w:sz w:val="30"/>
+          <w:u w:val="single"/>
+        </w:rPr>
+        <w:t xml:space="preserve">         </w:t>
+      </w:r>
+      <w:r>
+        <w:rPr>
+          <w:rFonts w:hint="eastAsia"/>
+          <w:sz w:val="30"/>
+          <w:u w:val="single"/>
+        </w:rPr>
+        <w:t xml:space="preserve"> </w:t>
+      </w:r>
+      <w:r>
+        <w:rPr>
+          <w:sz w:val="30"/>
+          <w:u w:val="single"/>
+        </w:rPr>
+        <w:t>23030301</w:t>
+      </w:r>
+      <w:r>
+        <w:rPr>
+          <w:rFonts w:hint="eastAsia"/>
+          <w:sz w:val="30"/>
+          <w:u w:val="single"/>
+        </w:rPr>
+        <w:t xml:space="preserve">         </w:t>
+      </w:r>
+      <w:r>
+        <w:rPr>
+          <w:sz w:val="30"/>
+          <w:u w:val="single"/>
+        </w:rPr>
+        <w:t xml:space="preserve"> </w:t>
       </w:r>
     </w:p>
     <w:p>
       <w:pPr>
         <w:spacing w:line="480" w:lineRule="auto"/>
-        <w:ind w:firstLine="1807" w:firstLineChars="600"/>
+        <w:ind w:firstLineChars="600" w:firstLine="1800"/>
         <w:rPr>
           <w:sz w:val="30"/>
           <w:u w:val="single"/>
@@ -304,33 +401,86 @@
       </w:pPr>
       <w:r>
         <w:rPr>
-          <w:rFonts w:hint="eastAsia"/>
-          <w:b/>
-          <w:sz w:val="30"/>
-        </w:rPr>
-        <w:t xml:space="preserve"/>
-      </w:r>
-      <w:r>
-        <w:rPr>
-          <w:rFonts w:ascii="Times New Roman" w:hAnsi="Times New Roman" w:eastAsia="宋体"/>
-          <w:sz w:val="30"/>
-          <w:u w:val="none"/>
-        </w:rPr>
-        <w:t xml:space="preserve">姓    名              </w:t>
-      </w:r>
-      <w:r>
-        <w:rPr>
-          <w:rFonts w:ascii="Times New Roman" w:hAnsi="Times New Roman" w:eastAsia="宋体"/>
-          <w:sz w:val="30"/>
-          <w:u w:val="single"/>
-        </w:rPr>
-        <w:t xml:space="preserve">   曹磊   </w:t>
+          <w:sz w:val="30"/>
+        </w:rPr>
+        <w:t>姓</w:t>
+      </w:r>
+      <w:r>
+        <w:rPr>
+          <w:sz w:val="30"/>
+        </w:rPr>
+        <w:t xml:space="preserve">    </w:t>
+      </w:r>
+      <w:r>
+        <w:rPr>
+          <w:sz w:val="30"/>
+        </w:rPr>
+        <w:t>名</w:t>
+      </w:r>
+      <w:r>
+        <w:rPr>
+          <w:sz w:val="30"/>
+        </w:rPr>
+        <w:t xml:space="preserve"> </w:t>
+      </w:r>
+      <w:r>
+        <w:rPr>
+          <w:rFonts w:hint="eastAsia"/>
+          <w:sz w:val="30"/>
+          <w:u w:val="single"/>
+        </w:rPr>
+        <w:t xml:space="preserve">           </w:t>
+      </w:r>
+      <w:r>
+        <w:rPr>
+          <w:rFonts w:hint="eastAsia"/>
+          <w:sz w:val="30"/>
+          <w:u w:val="single"/>
+        </w:rPr>
+        <w:t xml:space="preserve">  </w:t>
+      </w:r>
+      <w:r>
+        <w:rPr>
+          <w:sz w:val="30"/>
+          <w:u w:val="single"/>
+        </w:rPr>
+        <w:t>曹磊</w:t>
+      </w:r>
+      <w:r>
+        <w:rPr>
+          <w:rFonts w:hint="eastAsia"/>
+          <w:sz w:val="30"/>
+          <w:u w:val="single"/>
+        </w:rPr>
+        <w:t xml:space="preserve"> </w:t>
+      </w:r>
+      <w:r>
+        <w:rPr>
+          <w:sz w:val="30"/>
+          <w:u w:val="single"/>
+        </w:rPr>
+        <w:t xml:space="preserve"> </w:t>
+      </w:r>
+      <w:r>
+        <w:rPr>
+          <w:rFonts w:hint="eastAsia"/>
+          <w:sz w:val="30"/>
+          <w:u w:val="single"/>
+        </w:rPr>
+        <w:t xml:space="preserve">         </w:t>
+      </w:r>
+      <w:r>
+        <w:rPr>
+          <w:sz w:val="30"/>
+          <w:u w:val="single"/>
+        </w:rPr>
+        <w:t xml:space="preserve"> </w:t>
       </w:r>
     </w:p>
     <w:p>
       <w:pPr>
         <w:spacing w:line="480" w:lineRule="auto"/>
-        <w:ind w:firstLine="1807" w:firstLineChars="600"/>
+        <w:ind w:firstLineChars="600" w:firstLine="1807"/>
         <w:rPr>
           <w:sz w:val="30"/>
           <w:u w:val="single"/>
@@ -366,7 +516,15 @@
           <w:sz w:val="30"/>
           <w:u w:val="single"/>
         </w:rPr>
-        <w:t xml:space="preserve">       </w:t>
+        <w:t xml:space="preserve">      </w:t>
+      </w:r>
+      <w:r>
+        <w:rPr>
+          <w:rFonts w:hint="eastAsia"/>
+          <w:sz w:val="30"/>
+          <w:u w:val="single"/>
+        </w:rPr>
+        <w:t xml:space="preserve"> </w:t>
       </w:r>
       <w:r>
         <w:rPr>
@@ -382,7 +540,15 @@
           <w:sz w:val="30"/>
           <w:u w:val="single"/>
         </w:rPr>
-        <w:t xml:space="preserve">  </w:t>
+        <w:t xml:space="preserve"> </w:t>
+      </w:r>
+      <w:r>
+        <w:rPr>
+          <w:rFonts w:hint="eastAsia"/>
+          <w:sz w:val="30"/>
+          <w:u w:val="single"/>
+        </w:rPr>
+        <w:t xml:space="preserve"> </w:t>
       </w:r>
       <w:r>
         <w:rPr>
@@ -398,7 +564,23 @@
           <w:sz w:val="30"/>
           <w:u w:val="single"/>
         </w:rPr>
-        <w:t xml:space="preserve">         </w:t>
+        <w:t xml:space="preserve">    </w:t>
+      </w:r>
+      <w:r>
+        <w:rPr>
+          <w:rFonts w:hint="eastAsia"/>
+          <w:sz w:val="30"/>
+          <w:u w:val="single"/>
+        </w:rPr>
+        <w:t xml:space="preserve"> </w:t>
+      </w:r>
+      <w:r>
+        <w:rPr>
+          <w:rFonts w:hint="eastAsia"/>
+          <w:sz w:val="30"/>
+          <w:u w:val="single"/>
+        </w:rPr>
+        <w:t xml:space="preserve">    </w:t>
       </w:r>
     </w:p>
     <w:p>
@@ -621,7 +803,84 @@
                 <w:rFonts w:hint="eastAsia"/>
                 <w:sz w:val="30"/>
               </w:rPr>
-              <w:t xml:space="preserve">2026年6月15日 - 2026年6月19日</w:t>
+              <w:t>2026</w:t>
+            </w:r>
+            <w:r>
+              <w:rPr>
+                <w:rFonts w:hint="eastAsia"/>
+                <w:sz w:val="30"/>
+              </w:rPr>
+              <w:t>年</w:t>
+            </w:r>
+            <w:r>
+              <w:rPr>
+                <w:rFonts w:hint="eastAsia"/>
+                <w:sz w:val="30"/>
+              </w:rPr>
+              <w:t>6</w:t>
+            </w:r>
+            <w:r>
+              <w:rPr>
+                <w:rFonts w:hint="eastAsia"/>
+                <w:sz w:val="30"/>
+              </w:rPr>
+              <w:t>月</w:t>
+            </w:r>
+            <w:r>
+              <w:rPr>
+                <w:rFonts w:hint="eastAsia"/>
+                <w:sz w:val="30"/>
+              </w:rPr>
+              <w:t>15</w:t>
+            </w:r>
+            <w:r>
+              <w:rPr>
+                <w:rFonts w:hint="eastAsia"/>
+                <w:sz w:val="30"/>
+              </w:rPr>
+              <w:t>日</w:t>
+            </w:r>
+            <w:r>
+              <w:rPr>
+                <w:rFonts w:hint="eastAsia"/>
+                <w:sz w:val="30"/>
+              </w:rPr>
+              <w:t xml:space="preserve"> - 2026</w:t>
+            </w:r>
+            <w:r>
+              <w:rPr>
+                <w:rFonts w:hint="eastAsia"/>
+                <w:sz w:val="30"/>
+              </w:rPr>
+              <w:t>年</w:t>
+            </w:r>
+            <w:r>
+              <w:rPr>
+                <w:rFonts w:hint="eastAsia"/>
+                <w:sz w:val="30"/>
+              </w:rPr>
+              <w:t>6</w:t>
+            </w:r>
+            <w:r>
+              <w:rPr>
+                <w:rFonts w:hint="eastAsia"/>
+                <w:sz w:val="30"/>
+              </w:rPr>
+              <w:t>月</w:t>
+            </w:r>
+            <w:r>
+              <w:rPr>
+                <w:rFonts w:hint="eastAsia"/>
+                <w:sz w:val="30"/>
+              </w:rPr>
+              <w:t>19</w:t>
+            </w:r>
+            <w:r>
+              <w:rPr>
+                <w:rFonts w:hint="eastAsia"/>
+                <w:sz w:val="30"/>
+              </w:rPr>
+              <w:t>日</w:t>
             </w:r>
           </w:p>
         </w:tc>
@@ -667,12 +926,246 @@
               <w:rPr>
                 <w:bCs/>
               </w:rPr>
-              <w:t xml:space="preserve">1. 开展水果生鲜运营平台项目的需求分析与可行性研究。针对生鲜水果在线零售与配送的具体商业场景，深度梳理出管理后台与微信小程序客户端的完整业务闭环。管理后台的核心功能被细化为“水果分类管理”（包括分类的新增、编辑、排序以及状态变更）、“水果品种维护”（支持单品信息编辑、口感口味规格配置、起售停售拦截）、“订单处理与状态流转”（涵盖待付款、待接单、派送中、已完成等状态的手动与自动变更）以及“运营数据可视化大屏”（展示今日销售额、订单量、新增用户以及畅销商品排名）。微信小程序客户端则规划为 C 端用户的消费入口，主要用例包括“水果分类与商品列表的动态浏览”、“商品多口味规格选择”、“购物车数据的本地与云端同步加购”、“收货地址簿的增删改查”以及“订单确认、拉起微信支付与配送状态追踪”。通过对核心业务的梳理，我们构建了系统的顶层用例模型，消除功能边界上的歧义，明确了超级管理员、普通运营员以及普通用户之间的职责隔离。</w:t>
+              <w:t xml:space="preserve">1. </w:t>
+            </w:r>
+            <w:r>
+              <w:rPr>
+                <w:bCs/>
+              </w:rPr>
+              <w:t>开展水果生鲜运营平台项目的需求分析与可行性研究。针对生鲜水果在线零售与配送的具体商业场景，深度梳理出管理后台与微信小程序客户端的完整业务闭环。管理后台的核心功能被细化为</w:t>
+            </w:r>
+            <w:r>
+              <w:rPr>
+                <w:bCs/>
+              </w:rPr>
+              <w:t>“</w:t>
+            </w:r>
+            <w:r>
+              <w:rPr>
+                <w:bCs/>
+              </w:rPr>
+              <w:t>水果分类管理</w:t>
+            </w:r>
+            <w:r>
+              <w:rPr>
+                <w:bCs/>
+              </w:rPr>
+              <w:t>”</w:t>
+            </w:r>
+            <w:r>
+              <w:rPr>
+                <w:bCs/>
+              </w:rPr>
+              <w:t>（包括分类的新增、编辑、排序以及状态变更）、</w:t>
+            </w:r>
+            <w:r>
+              <w:rPr>
+                <w:bCs/>
+              </w:rPr>
+              <w:t>“</w:t>
+            </w:r>
+            <w:r>
+              <w:rPr>
+                <w:bCs/>
+              </w:rPr>
+              <w:t>水果品种维护</w:t>
+            </w:r>
+            <w:r>
+              <w:rPr>
+                <w:bCs/>
+              </w:rPr>
+              <w:t>”</w:t>
+            </w:r>
+            <w:r>
+              <w:rPr>
+                <w:bCs/>
+              </w:rPr>
+              <w:t>（支持单品信息编辑、口感口味规格配置、起售停售拦截）、</w:t>
+            </w:r>
+            <w:r>
+              <w:rPr>
+                <w:bCs/>
+              </w:rPr>
+              <w:t>“</w:t>
+            </w:r>
+            <w:r>
+              <w:rPr>
+                <w:bCs/>
+              </w:rPr>
+              <w:t>订单处理与状态流转</w:t>
+            </w:r>
+            <w:r>
+              <w:rPr>
+                <w:bCs/>
+              </w:rPr>
+              <w:t>”</w:t>
+            </w:r>
+            <w:r>
+              <w:rPr>
+                <w:bCs/>
+              </w:rPr>
+              <w:t>（涵盖待付款、待接单、派送中、已完成等状态的手动与自动变更）以及</w:t>
+            </w:r>
+            <w:r>
+              <w:rPr>
+                <w:bCs/>
+              </w:rPr>
+              <w:t>“</w:t>
+            </w:r>
+            <w:r>
+              <w:rPr>
+                <w:bCs/>
+              </w:rPr>
+              <w:t>运营数据可视化大屏</w:t>
+            </w:r>
+            <w:r>
+              <w:rPr>
+                <w:bCs/>
+              </w:rPr>
+              <w:t>”</w:t>
+            </w:r>
+            <w:r>
+              <w:rPr>
+                <w:bCs/>
+              </w:rPr>
+              <w:t>（展示今日销售额、订单量、新增用户以及畅销商品排名）。微信小程序客户端则规划为</w:t>
+            </w:r>
+            <w:r>
+              <w:rPr>
+                <w:bCs/>
+              </w:rPr>
+              <w:t xml:space="preserve"> C </w:t>
+            </w:r>
+            <w:r>
+              <w:rPr>
+                <w:bCs/>
+              </w:rPr>
+              <w:t>端用户的消费入口，主要用例包括</w:t>
+            </w:r>
+            <w:r>
+              <w:rPr>
+                <w:bCs/>
+              </w:rPr>
+              <w:t>“</w:t>
+            </w:r>
+            <w:r>
+              <w:rPr>
+                <w:bCs/>
+              </w:rPr>
+              <w:t>水果分类与商品列表的动态浏览</w:t>
+            </w:r>
+            <w:r>
+              <w:rPr>
+                <w:bCs/>
+              </w:rPr>
+              <w:t>”</w:t>
+            </w:r>
+            <w:r>
+              <w:rPr>
+                <w:bCs/>
+              </w:rPr>
+              <w:t>、</w:t>
+            </w:r>
+            <w:r>
+              <w:rPr>
+                <w:bCs/>
+              </w:rPr>
+              <w:t>“</w:t>
+            </w:r>
+            <w:r>
+              <w:rPr>
+                <w:bCs/>
+              </w:rPr>
+              <w:t>商品多口味规格选择</w:t>
+            </w:r>
+            <w:r>
+              <w:rPr>
+                <w:bCs/>
+              </w:rPr>
+              <w:t>”</w:t>
+            </w:r>
+            <w:r>
+              <w:rPr>
+                <w:bCs/>
+              </w:rPr>
+              <w:t>、</w:t>
+            </w:r>
+            <w:r>
+              <w:rPr>
+                <w:bCs/>
+              </w:rPr>
+              <w:t>“</w:t>
+            </w:r>
+            <w:r>
+              <w:rPr>
+                <w:bCs/>
+              </w:rPr>
+              <w:t>购物车数据的本地与云端同步加购</w:t>
+            </w:r>
+            <w:r>
+              <w:rPr>
+                <w:bCs/>
+              </w:rPr>
+              <w:t>”</w:t>
+            </w:r>
+            <w:r>
+              <w:rPr>
+                <w:bCs/>
+              </w:rPr>
+              <w:t>、</w:t>
+            </w:r>
+            <w:r>
+              <w:rPr>
+                <w:bCs/>
+              </w:rPr>
+              <w:t>“</w:t>
+            </w:r>
+            <w:r>
+              <w:rPr>
+                <w:bCs/>
+              </w:rPr>
+              <w:t>收货地址簿的增删改查</w:t>
+            </w:r>
+            <w:r>
+              <w:rPr>
+                <w:bCs/>
+              </w:rPr>
+              <w:t>”</w:t>
+            </w:r>
+            <w:r>
+              <w:rPr>
+                <w:bCs/>
+              </w:rPr>
+              <w:t>以及</w:t>
+            </w:r>
+            <w:r>
+              <w:rPr>
+                <w:bCs/>
+              </w:rPr>
+              <w:t>“</w:t>
+            </w:r>
+            <w:r>
+              <w:rPr>
+                <w:bCs/>
+              </w:rPr>
+              <w:t>订单确认、拉起微信支付与配送状态追踪</w:t>
+            </w:r>
+            <w:r>
+              <w:rPr>
+                <w:bCs/>
+              </w:rPr>
+              <w:t>”</w:t>
+            </w:r>
+            <w:r>
+              <w:rPr>
+                <w:bCs/>
+              </w:rPr>
+              <w:t>。通过对核心业务的梳理，我们构建了系统的顶层用例模型，消除功能边界上的歧义，明确了超级管理员、普通运营员以及普通用户之间的职责隔离。</w:t>
             </w:r>
           </w:p>
           <w:p>
             <w:pPr>
-              <w:ind w:firstLine="480" w:firstLineChars="200"/>
+              <w:ind w:firstLineChars="200" w:firstLine="480"/>
               <w:rPr>
                 <w:bCs/>
               </w:rPr>
@@ -680,7 +1173,7 @@
           </w:p>
           <w:p>
             <w:pPr>
-              <w:ind w:firstLine="480" w:firstLineChars="200"/>
+              <w:ind w:firstLineChars="200" w:firstLine="480"/>
               <w:rPr>
                 <w:bCs/>
               </w:rPr>
@@ -720,10 +1213,40 @@
           </w:tcPr>
           <w:p>
             <w:pPr>
-              <w:ind w:firstLine="480" w:firstLineChars="200"/>
+              <w:ind w:firstLineChars="200" w:firstLine="480"/>
             </w:pPr>
             <w:r>
-              <w:t xml:space="preserve">在本周的设计工作中，我深刻体会到了在分布式系统开发中“需求先行、架构先行”的重要性。通过对分类、单品与果篮套餐数据之间一对多和多对多关联模型的梳理，我掌握了如何在不使用物理外键强约束的前提下，利用应用层逻辑保障数据一致性的分布式设计思想。物理外键虽然能在数据库层面保证引用完整性，但在高并发场景下会导致频繁的行锁甚至表锁，并且不利于后续微服务的数据库物理拆分。因此，在业务逻辑层（如删除分类前先查询商品表是否引用）来确保完整性，是分布式系统更为主流的设计选择。此外，通过微服务边界的合理划分，我理解了将流量入口、高频读写服务与低频鉴权、通知服务物理隔离，对于保障整个生鲜运营系统整体高可用性的核心价值。网关 lgg-gateway 能够屏蔽后端微服务的物理 IP 和端口细节，不仅提高了系统的安全性，也为后续服务的横向弹性扩容打下了坚实的基础。通过绘制 E-R 图和模块依赖图，我的系统设计思维得到了极大的锻炼，也为下周的代码实现指明了清晰的方向。</w:t>
+              <w:t>在本周的设计工作中，我深刻体会到了在分布式系统开发中</w:t>
+            </w:r>
+            <w:r>
+              <w:t>“</w:t>
+            </w:r>
+            <w:r>
+              <w:t>需求先行、架构先行</w:t>
+            </w:r>
+            <w:r>
+              <w:t>”</w:t>
+            </w:r>
+            <w:r>
+              <w:t>的重要性。通过对分类、单品与果篮套餐数据之间一对多和多对多关联模型的梳理，我掌握了如何在不使用物理外键强约束的前提下，利用应用层逻辑保障数据一致性的分布式设计思想。物理外键虽然能在数据库层面保证引用完整性，但在高并发场景下会导致频繁的行锁甚至表锁，并且不利于后续微服务的数据库物理拆分。因此，在业务逻辑层（如删除分类前先查询商品表是否引用）来确保完整性，是分布式系统更为主流的设计选择。此外，通过微服务边界的合理划分，我理解了将流量入口、高频读写服务与低频鉴权、通知服务物理隔离，对于保障整个生鲜运营系统整体高可用性的核心价值。网关</w:t>
+            </w:r>
+            <w:r>
+              <w:t xml:space="preserve"> lgg-gateway </w:t>
+            </w:r>
+            <w:r>
+              <w:t>能够屏蔽后端微服务的物理</w:t>
+            </w:r>
+            <w:r>
+              <w:t xml:space="preserve"> IP </w:t>
+            </w:r>
+            <w:r>
+              <w:t>和端口细节，不仅提高了系统的安全性，也为后续服务的横向弹性扩容打下了坚实的基础。通过绘制</w:t>
+            </w:r>
+            <w:r>
+              <w:t xml:space="preserve"> E-R </w:t>
+            </w:r>
+            <w:r>
+              <w:t>图和模块依赖图，我的系统设计思维得到了极大的锻炼，也为下周的代码实现指明了清晰的方向。</w:t>
             </w:r>
           </w:p>
         </w:tc>
@@ -831,7 +1354,7 @@
   <w:docDefaults>
     <w:rPrDefault>
       <w:rPr>
-        <w:rFonts w:ascii="Times New Roman" w:hAnsi="Times New Roman" w:eastAsia="宋体" w:cs="Times New Roman"/>
+        <w:rFonts w:ascii="Times New Roman" w:eastAsia="宋体" w:hAnsi="Times New Roman" w:cs="Times New Roman"/>
         <w:lang w:val="en-US" w:eastAsia="zh-CN" w:bidi="ar-SA"/>
       </w:rPr>
     </w:rPrDefault>
@@ -840,14 +1363,14 @@
   <w:latentStyles w:defLockedState="0" w:defUIPriority="99" w:defSemiHidden="0" w:defUnhideWhenUsed="0" w:defQFormat="0" w:count="376">
     <w:lsdException w:name="Normal" w:uiPriority="0" w:qFormat="1"/>
     <w:lsdException w:name="heading 1" w:uiPriority="9" w:qFormat="1"/>
-    <w:lsdException w:name="heading 2" w:uiPriority="9" w:semiHidden="1" w:unhideWhenUsed="1" w:qFormat="1"/>
+    <w:lsdException w:name="heading 2" w:semiHidden="1" w:uiPriority="9" w:unhideWhenUsed="1" w:qFormat="1"/>
     <w:lsdException w:name="heading 3" w:uiPriority="9" w:unhideWhenUsed="1" w:qFormat="1"/>
-    <w:lsdException w:name="heading 4" w:uiPriority="9" w:semiHidden="1" w:unhideWhenUsed="1" w:qFormat="1"/>
-    <w:lsdException w:name="heading 5" w:uiPriority="9" w:semiHidden="1" w:unhideWhenUsed="1" w:qFormat="1"/>
-    <w:lsdException w:name="heading 6" w:uiPriority="9" w:semiHidden="1" w:unhideWhenUsed="1" w:qFormat="1"/>
-    <w:lsdException w:name="heading 7" w:uiPriority="9" w:semiHidden="1" w:unhideWhenUsed="1" w:qFormat="1"/>
-    <w:lsdException w:name="heading 8" w:uiPriority="9" w:semiHidden="1" w:unhideWhenUsed="1" w:qFormat="1"/>
-    <w:lsdException w:name="heading 9" w:uiPriority="9" w:semiHidden="1" w:unhideWhenUsed="1" w:qFormat="1"/>
+    <w:lsdException w:name="heading 4" w:semiHidden="1" w:uiPriority="9" w:unhideWhenUsed="1" w:qFormat="1"/>
+    <w:lsdException w:name="heading 5" w:semiHidden="1" w:uiPriority="9" w:unhideWhenUsed="1" w:qFormat="1"/>
+    <w:lsdException w:name="heading 6" w:semiHidden="1" w:uiPriority="9" w:unhideWhenUsed="1" w:qFormat="1"/>
+    <w:lsdException w:name="heading 7" w:semiHidden="1" w:uiPriority="9" w:unhideWhenUsed="1" w:qFormat="1"/>
+    <w:lsdException w:name="heading 8" w:semiHidden="1" w:uiPriority="9" w:unhideWhenUsed="1" w:qFormat="1"/>
+    <w:lsdException w:name="heading 9" w:semiHidden="1" w:uiPriority="9" w:unhideWhenUsed="1" w:qFormat="1"/>
     <w:lsdException w:name="index 1" w:semiHidden="1" w:unhideWhenUsed="1"/>
     <w:lsdException w:name="index 2" w:semiHidden="1" w:unhideWhenUsed="1"/>
     <w:lsdException w:name="index 3" w:semiHidden="1" w:unhideWhenUsed="1"/>
@@ -857,22 +1380,22 @@
     <w:lsdException w:name="index 7" w:semiHidden="1" w:unhideWhenUsed="1"/>
     <w:lsdException w:name="index 8" w:semiHidden="1" w:unhideWhenUsed="1"/>
     <w:lsdException w:name="index 9" w:semiHidden="1" w:unhideWhenUsed="1"/>
-    <w:lsdException w:name="toc 1" w:uiPriority="39" w:semiHidden="1" w:unhideWhenUsed="1"/>
-    <w:lsdException w:name="toc 2" w:uiPriority="39" w:semiHidden="1" w:unhideWhenUsed="1"/>
-    <w:lsdException w:name="toc 3" w:uiPriority="39" w:semiHidden="1" w:unhideWhenUsed="1"/>
-    <w:lsdException w:name="toc 4" w:uiPriority="39" w:semiHidden="1" w:unhideWhenUsed="1"/>
-    <w:lsdException w:name="toc 5" w:uiPriority="39" w:semiHidden="1" w:unhideWhenUsed="1"/>
-    <w:lsdException w:name="toc 6" w:uiPriority="39" w:semiHidden="1" w:unhideWhenUsed="1"/>
-    <w:lsdException w:name="toc 7" w:uiPriority="39" w:semiHidden="1" w:unhideWhenUsed="1"/>
-    <w:lsdException w:name="toc 8" w:uiPriority="39" w:semiHidden="1" w:unhideWhenUsed="1"/>
-    <w:lsdException w:name="toc 9" w:uiPriority="39" w:semiHidden="1" w:unhideWhenUsed="1"/>
+    <w:lsdException w:name="toc 1" w:semiHidden="1" w:uiPriority="39" w:unhideWhenUsed="1"/>
+    <w:lsdException w:name="toc 2" w:semiHidden="1" w:uiPriority="39" w:unhideWhenUsed="1"/>
+    <w:lsdException w:name="toc 3" w:semiHidden="1" w:uiPriority="39" w:unhideWhenUsed="1"/>
+    <w:lsdException w:name="toc 4" w:semiHidden="1" w:uiPriority="39" w:unhideWhenUsed="1"/>
+    <w:lsdException w:name="toc 5" w:semiHidden="1" w:uiPriority="39" w:unhideWhenUsed="1"/>
+    <w:lsdException w:name="toc 6" w:semiHidden="1" w:uiPriority="39" w:unhideWhenUsed="1"/>
+    <w:lsdException w:name="toc 7" w:semiHidden="1" w:uiPriority="39" w:unhideWhenUsed="1"/>
+    <w:lsdException w:name="toc 8" w:semiHidden="1" w:uiPriority="39" w:unhideWhenUsed="1"/>
+    <w:lsdException w:name="toc 9" w:semiHidden="1" w:uiPriority="39" w:unhideWhenUsed="1"/>
     <w:lsdException w:name="Normal Indent" w:semiHidden="1" w:unhideWhenUsed="1"/>
     <w:lsdException w:name="footnote text" w:semiHidden="1" w:unhideWhenUsed="1"/>
     <w:lsdException w:name="annotation text" w:semiHidden="1" w:unhideWhenUsed="1" w:qFormat="1"/>
     <w:lsdException w:name="header" w:unhideWhenUsed="1" w:qFormat="1"/>
     <w:lsdException w:name="footer" w:unhideWhenUsed="1" w:qFormat="1"/>
     <w:lsdException w:name="index heading" w:semiHidden="1" w:unhideWhenUsed="1"/>
-    <w:lsdException w:name="caption" w:uiPriority="35" w:semiHidden="1" w:unhideWhenUsed="1" w:qFormat="1"/>
+    <w:lsdException w:name="caption" w:semiHidden="1" w:uiPriority="35" w:unhideWhenUsed="1" w:qFormat="1"/>
     <w:lsdException w:name="table of figures" w:semiHidden="1" w:unhideWhenUsed="1"/>
     <w:lsdException w:name="envelope address" w:semiHidden="1" w:unhideWhenUsed="1"/>
     <w:lsdException w:name="envelope return" w:semiHidden="1" w:unhideWhenUsed="1"/>
@@ -903,7 +1426,7 @@
     <w:lsdException w:name="Title" w:uiPriority="10" w:qFormat="1"/>
     <w:lsdException w:name="Closing" w:semiHidden="1" w:unhideWhenUsed="1"/>
     <w:lsdException w:name="Signature" w:semiHidden="1" w:unhideWhenUsed="1"/>
-    <w:lsdException w:name="Default Paragraph Font" w:uiPriority="1" w:semiHidden="1" w:unhideWhenUsed="1" w:qFormat="1"/>
+    <w:lsdException w:name="Default Paragraph Font" w:semiHidden="1" w:uiPriority="1" w:unhideWhenUsed="1" w:qFormat="1"/>
     <w:lsdException w:name="Body Text" w:semiHidden="1" w:unhideWhenUsed="1"/>
     <w:lsdException w:name="Body Text Indent" w:semiHidden="1" w:unhideWhenUsed="1"/>
     <w:lsdException w:name="List Continue" w:semiHidden="1" w:unhideWhenUsed="1"/>
@@ -1103,8 +1626,8 @@
     <w:lsdException w:name="Subtle Reference" w:uiPriority="31" w:qFormat="1"/>
     <w:lsdException w:name="Intense Reference" w:uiPriority="32" w:qFormat="1"/>
     <w:lsdException w:name="Book Title" w:uiPriority="33" w:qFormat="1"/>
-    <w:lsdException w:name="Bibliography" w:uiPriority="37" w:semiHidden="1" w:unhideWhenUsed="1"/>
-    <w:lsdException w:name="TOC Heading" w:uiPriority="39" w:semiHidden="1" w:unhideWhenUsed="1" w:qFormat="1"/>
+    <w:lsdException w:name="Bibliography" w:semiHidden="1" w:uiPriority="37" w:unhideWhenUsed="1"/>
+    <w:lsdException w:name="TOC Heading" w:semiHidden="1" w:uiPriority="39" w:unhideWhenUsed="1" w:qFormat="1"/>
     <w:lsdException w:name="Plain Table 1" w:uiPriority="41"/>
     <w:lsdException w:name="Plain Table 2" w:uiPriority="42"/>
     <w:lsdException w:name="Plain Table 3" w:uiPriority="43"/>
@@ -1215,7 +1738,7 @@
     <w:lsdException w:name="Unresolved Mention" w:semiHidden="1" w:unhideWhenUsed="1"/>
     <w:lsdException w:name="Smart Link" w:semiHidden="1" w:unhideWhenUsed="1"/>
   </w:latentStyles>
-  <w:style w:type="paragraph" w:styleId="a" w:default="1">
+  <w:style w:type="paragraph" w:default="1" w:styleId="a">
     <w:name w:val="Normal"/>
     <w:qFormat/>
     <w:pPr>
@@ -1267,7 +1790,7 @@
       <w:outlineLvl w:val="1"/>
     </w:pPr>
     <w:rPr>
-      <w:rFonts w:asciiTheme="majorHAnsi" w:hAnsiTheme="majorHAnsi" w:eastAsiaTheme="majorEastAsia" w:cstheme="majorBidi"/>
+      <w:rFonts w:asciiTheme="majorHAnsi" w:eastAsiaTheme="majorEastAsia" w:hAnsiTheme="majorHAnsi" w:cstheme="majorBidi"/>
       <w:b/>
       <w:bCs/>
       <w:sz w:val="32"/>
@@ -1292,7 +1815,7 @@
       <w:outlineLvl w:val="2"/>
     </w:pPr>
     <w:rPr>
-      <w:rFonts w:asciiTheme="minorHAnsi" w:hAnsiTheme="minorHAnsi" w:eastAsiaTheme="minorEastAsia" w:cstheme="minorBidi"/>
+      <w:rFonts w:asciiTheme="minorHAnsi" w:eastAsiaTheme="minorEastAsia" w:hAnsiTheme="minorHAnsi" w:cstheme="minorBidi"/>
       <w:b/>
       <w:bCs/>
       <w:kern w:val="2"/>
@@ -1300,13 +1823,13 @@
       <w:szCs w:val="32"/>
     </w:rPr>
   </w:style>
-  <w:style w:type="character" w:styleId="a0" w:default="1">
+  <w:style w:type="character" w:default="1" w:styleId="a0">
     <w:name w:val="Default Paragraph Font"/>
     <w:uiPriority w:val="1"/>
     <w:semiHidden/>
     <w:unhideWhenUsed/>
   </w:style>
-  <w:style w:type="table" w:styleId="a1" w:default="1">
+  <w:style w:type="table" w:default="1" w:styleId="a1">
     <w:name w:val="Normal Table"/>
     <w:uiPriority w:val="99"/>
     <w:semiHidden/>
@@ -1321,7 +1844,7 @@
       </w:tblCellMar>
     </w:tblPr>
   </w:style>
-  <w:style w:type="numbering" w:styleId="a2" w:default="1">
+  <w:style w:type="numbering" w:default="1" w:styleId="a2">
     <w:name w:val="No List"/>
     <w:uiPriority w:val="99"/>
     <w:semiHidden/>
@@ -1367,7 +1890,7 @@
     <w:qFormat/>
     <w:pPr>
       <w:pBdr>
-        <w:bottom w:val="single" w:color="auto" w:sz="6" w:space="1"/>
+        <w:bottom w:val="single" w:sz="6" w:space="1" w:color="auto"/>
       </w:pBdr>
       <w:tabs>
         <w:tab w:val="center" w:pos="4153"/>
@@ -1403,12 +1926,12 @@
     <w:qFormat/>
     <w:tblPr>
       <w:tblBorders>
-        <w:top w:val="single" w:color="auto" w:sz="4" w:space="0"/>
-        <w:left w:val="single" w:color="auto" w:sz="4" w:space="0"/>
-        <w:bottom w:val="single" w:color="auto" w:sz="4" w:space="0"/>
-        <w:right w:val="single" w:color="auto" w:sz="4" w:space="0"/>
-        <w:insideH w:val="single" w:color="auto" w:sz="4" w:space="0"/>
-        <w:insideV w:val="single" w:color="auto" w:sz="4" w:space="0"/>
+        <w:top w:val="single" w:sz="4" w:space="0" w:color="auto"/>
+        <w:left w:val="single" w:sz="4" w:space="0" w:color="auto"/>
+        <w:bottom w:val="single" w:sz="4" w:space="0" w:color="auto"/>
+        <w:right w:val="single" w:sz="4" w:space="0" w:color="auto"/>
+        <w:insideH w:val="single" w:sz="4" w:space="0" w:color="auto"/>
+        <w:insideV w:val="single" w:sz="4" w:space="0" w:color="auto"/>
       </w:tblBorders>
     </w:tblPr>
   </w:style>
@@ -1432,14 +1955,14 @@
       <w:u w:val="single"/>
     </w:rPr>
   </w:style>
-  <w:style w:type="character" w:styleId="10" w:customStyle="1">
+  <w:style w:type="character" w:customStyle="1" w:styleId="10">
     <w:name w:val="标题 1 字符"/>
     <w:basedOn w:val="a0"/>
     <w:link w:val="1"/>
     <w:uiPriority w:val="9"/>
     <w:qFormat/>
     <w:rPr>
-      <w:rFonts w:ascii="Times New Roman" w:hAnsi="Times New Roman" w:eastAsia="宋体" w:cs="宋体"/>
+      <w:rFonts w:ascii="Times New Roman" w:eastAsia="宋体" w:hAnsi="Times New Roman" w:cs="宋体"/>
       <w:b/>
       <w:bCs/>
       <w:kern w:val="44"/>
@@ -1453,36 +1976,36 @@
     <w:uiPriority w:val="34"/>
     <w:qFormat/>
     <w:pPr>
-      <w:ind w:firstLine="420" w:firstLineChars="200"/>
+      <w:ind w:firstLineChars="200" w:firstLine="420"/>
     </w:pPr>
   </w:style>
-  <w:style w:type="character" w:styleId="a7" w:customStyle="1">
+  <w:style w:type="character" w:customStyle="1" w:styleId="a7">
     <w:name w:val="页眉 字符"/>
     <w:basedOn w:val="a0"/>
     <w:link w:val="a6"/>
     <w:uiPriority w:val="99"/>
     <w:qFormat/>
     <w:rPr>
-      <w:rFonts w:ascii="Times New Roman" w:hAnsi="Times New Roman" w:eastAsia="宋体" w:cs="宋体"/>
+      <w:rFonts w:ascii="Times New Roman" w:eastAsia="宋体" w:hAnsi="Times New Roman" w:cs="宋体"/>
       <w:kern w:val="0"/>
       <w:sz w:val="18"/>
       <w:szCs w:val="18"/>
     </w:rPr>
   </w:style>
-  <w:style w:type="character" w:styleId="a5" w:customStyle="1">
+  <w:style w:type="character" w:customStyle="1" w:styleId="a5">
     <w:name w:val="页脚 字符"/>
     <w:basedOn w:val="a0"/>
     <w:link w:val="a4"/>
     <w:uiPriority w:val="99"/>
     <w:qFormat/>
     <w:rPr>
-      <w:rFonts w:ascii="Times New Roman" w:hAnsi="Times New Roman" w:eastAsia="宋体" w:cs="宋体"/>
+      <w:rFonts w:ascii="Times New Roman" w:eastAsia="宋体" w:hAnsi="Times New Roman" w:cs="宋体"/>
       <w:kern w:val="0"/>
       <w:sz w:val="18"/>
       <w:szCs w:val="18"/>
     </w:rPr>
   </w:style>
-  <w:style w:type="character" w:styleId="20" w:customStyle="1">
+  <w:style w:type="character" w:customStyle="1" w:styleId="20">
     <w:name w:val="标题 2 字符"/>
     <w:basedOn w:val="a0"/>
     <w:link w:val="2"/>
@@ -1490,7 +2013,7 @@
     <w:semiHidden/>
     <w:qFormat/>
     <w:rPr>
-      <w:rFonts w:asciiTheme="majorHAnsi" w:hAnsiTheme="majorHAnsi" w:eastAsiaTheme="majorEastAsia" w:cstheme="majorBidi"/>
+      <w:rFonts w:asciiTheme="majorHAnsi" w:eastAsiaTheme="majorEastAsia" w:hAnsiTheme="majorHAnsi" w:cstheme="majorBidi"/>
       <w:b/>
       <w:bCs/>
       <w:kern w:val="0"/>
@@ -1498,7 +2021,7 @@
       <w:szCs w:val="32"/>
     </w:rPr>
   </w:style>
-  <w:style w:type="character" w:styleId="30" w:customStyle="1">
+  <w:style w:type="character" w:customStyle="1" w:styleId="30">
     <w:name w:val="标题 3 字符"/>
     <w:basedOn w:val="a0"/>
     <w:link w:val="3"/>

</xml_diff>

<commit_message>
fix: doc table header injection, MinIO container & E2E blackbox verification pass
</commit_message>
<xml_diff>
--- a/docs/03-report/实训文档/23030301曹磊-1/1-第2周报.docx
+++ b/docs/03-report/实训文档/23030301曹磊-1/1-第2周报.docx
@@ -315,6 +315,7 @@
         <w:spacing w:line="480" w:lineRule="auto"/>
         <w:ind w:firstLineChars="600" w:firstLine="1800"/>
         <w:rPr>
+          <w:rFonts w:hint="eastAsia"/>
           <w:sz w:val="30"/>
           <w:u w:val="single"/>
         </w:rPr>
@@ -349,23 +350,7 @@
           <w:sz w:val="30"/>
           <w:u w:val="single"/>
         </w:rPr>
-        <w:t xml:space="preserve"> </w:t>
-      </w:r>
-      <w:r>
-        <w:rPr>
-          <w:rFonts w:hint="eastAsia"/>
-          <w:sz w:val="30"/>
-          <w:u w:val="single"/>
-        </w:rPr>
-        <w:t xml:space="preserve">         </w:t>
-      </w:r>
-      <w:r>
-        <w:rPr>
-          <w:rFonts w:hint="eastAsia"/>
-          <w:sz w:val="30"/>
-          <w:u w:val="single"/>
-        </w:rPr>
-        <w:t xml:space="preserve"> </w:t>
+        <w:t xml:space="preserve">           </w:t>
       </w:r>
       <w:r>
         <w:rPr>
@@ -429,15 +414,7 @@
           <w:sz w:val="30"/>
           <w:u w:val="single"/>
         </w:rPr>
-        <w:t xml:space="preserve">           </w:t>
-      </w:r>
-      <w:r>
-        <w:rPr>
-          <w:rFonts w:hint="eastAsia"/>
-          <w:sz w:val="30"/>
-          <w:u w:val="single"/>
-        </w:rPr>
-        <w:t xml:space="preserve">  </w:t>
+        <w:t xml:space="preserve">             </w:t>
       </w:r>
       <w:r>
         <w:rPr>

</xml_diff>

<commit_message>
fix: default disable frontend login captcha & repair doc6/doc10 table cell issues
</commit_message>
<xml_diff>
--- a/docs/03-report/实训文档/23030301曹磊-1/1-第2周报.docx
+++ b/docs/03-report/实训文档/23030301曹磊-1/1-第2周报.docx
@@ -228,7 +228,7 @@
     <w:p>
       <w:pPr>
         <w:spacing w:line="480" w:lineRule="auto"/>
-        <w:ind w:firstLineChars="600" w:firstLine="1800"/>
+        <w:ind w:firstLineChars="600" w:firstLine="1807"/>
         <w:rPr>
           <w:sz w:val="30"/>
           <w:u w:val="single"/>
@@ -236,24 +236,32 @@
       </w:pPr>
       <w:r>
         <w:rPr>
+          <w:b/>
+          <w:bCs/>
           <w:sz w:val="30"/>
         </w:rPr>
         <w:t>班</w:t>
       </w:r>
       <w:r>
         <w:rPr>
+          <w:b/>
+          <w:bCs/>
           <w:sz w:val="30"/>
         </w:rPr>
         <w:t xml:space="preserve">    </w:t>
       </w:r>
       <w:r>
         <w:rPr>
+          <w:b/>
+          <w:bCs/>
           <w:sz w:val="30"/>
         </w:rPr>
         <w:t>级</w:t>
       </w:r>
       <w:r>
         <w:rPr>
+          <w:b/>
+          <w:bCs/>
           <w:sz w:val="30"/>
         </w:rPr>
         <w:t xml:space="preserve"> </w:t>
@@ -313,27 +321,32 @@
     <w:p>
       <w:pPr>
         <w:spacing w:line="480" w:lineRule="auto"/>
-        <w:ind w:firstLineChars="600" w:firstLine="1800"/>
-        <w:rPr>
-          <w:rFonts w:hint="eastAsia"/>
+        <w:ind w:firstLineChars="600" w:firstLine="1807"/>
+        <w:rPr>
           <w:sz w:val="30"/>
           <w:u w:val="single"/>
         </w:rPr>
       </w:pPr>
       <w:r>
         <w:rPr>
+          <w:b/>
+          <w:bCs/>
           <w:sz w:val="30"/>
         </w:rPr>
         <w:t>学</w:t>
       </w:r>
       <w:r>
         <w:rPr>
+          <w:b/>
+          <w:bCs/>
           <w:sz w:val="30"/>
         </w:rPr>
         <w:t xml:space="preserve">    </w:t>
       </w:r>
       <w:r>
         <w:rPr>
+          <w:b/>
+          <w:bCs/>
           <w:sz w:val="30"/>
         </w:rPr>
         <w:t>号</w:t>
@@ -378,7 +391,7 @@
     <w:p>
       <w:pPr>
         <w:spacing w:line="480" w:lineRule="auto"/>
-        <w:ind w:firstLineChars="600" w:firstLine="1800"/>
+        <w:ind w:firstLineChars="600" w:firstLine="1807"/>
         <w:rPr>
           <w:sz w:val="30"/>
           <w:u w:val="single"/>
@@ -386,24 +399,32 @@
       </w:pPr>
       <w:r>
         <w:rPr>
+          <w:b/>
+          <w:bCs/>
           <w:sz w:val="30"/>
         </w:rPr>
         <w:t>姓</w:t>
       </w:r>
       <w:r>
         <w:rPr>
+          <w:b/>
+          <w:bCs/>
           <w:sz w:val="30"/>
         </w:rPr>
         <w:t xml:space="preserve">    </w:t>
       </w:r>
       <w:r>
         <w:rPr>
+          <w:b/>
+          <w:bCs/>
           <w:sz w:val="30"/>
         </w:rPr>
         <w:t>名</w:t>
       </w:r>
       <w:r>
         <w:rPr>
+          <w:b/>
+          <w:bCs/>
           <w:sz w:val="30"/>
         </w:rPr>
         <w:t xml:space="preserve"> </w:t>

</xml_diff>